<commit_message>
docs: standardize ABNT Word documents
Co-authored-by: Alexandre <Alexandre-Siq@users.noreply.github.com>
</commit_message>
<xml_diff>
--- a/docs/abnt-docx/arquitetura-abnt.docx
+++ b/docs/abnt-docx/arquitetura-abnt.docx
@@ -213,6 +213,7 @@
       <w:r>
         <w:rPr>
           <w:rFonts w:ascii="Times New Roman" w:hAnsi="Times New Roman"/>
+          <w:b w:val="0"/>
           <w:sz w:val="20"/>
         </w:rPr>
         <w:t>Trabalho acadêmico apresentado à disciplina Trabalho de Graduação 1 do curso de Análise e Desenvolvimento de Sistemas da FATEC PG, como parte das atividades de desenvolvimento e documentação do projeto MedAgenda.</w:t>
@@ -227,6 +228,7 @@
       <w:r>
         <w:rPr>
           <w:rFonts w:ascii="Times New Roman" w:hAnsi="Times New Roman"/>
+          <w:b w:val="0"/>
           <w:sz w:val="20"/>
         </w:rPr>
         <w:t>Professor: Bruno Baruffi Esteves.</w:t>
@@ -274,6 +276,107 @@
     </w:p>
     <w:p>
       <w:pPr>
+        <w:spacing w:line="360" w:lineRule="auto" w:after="0"/>
+        <w:jc w:val="center"/>
+      </w:pPr>
+      <w:r>
+        <w:rPr>
+          <w:rFonts w:ascii="Times New Roman" w:hAnsi="Times New Roman"/>
+          <w:b/>
+          <w:sz w:val="24"/>
+        </w:rPr>
+        <w:t>RESUMO</w:t>
+      </w:r>
+    </w:p>
+    <w:p/>
+    <w:p>
+      <w:pPr>
+        <w:spacing w:line="360" w:lineRule="auto" w:after="0"/>
+        <w:ind w:firstLine="709"/>
+        <w:jc w:val="both"/>
+      </w:pPr>
+      <w:r>
+        <w:rPr>
+          <w:rFonts w:ascii="Times New Roman" w:hAnsi="Times New Roman"/>
+          <w:b w:val="0"/>
+          <w:sz w:val="24"/>
+        </w:rPr>
+        <w:t>Este documento descreve a arquitetura técnica do MedAgenda, incluindo frontend, backend, banco de dados, autenticação, segurança e decisões estruturais adotadas no desenvolvimento.</w:t>
+      </w:r>
+    </w:p>
+    <w:p/>
+    <w:p>
+      <w:pPr>
+        <w:spacing w:line="360" w:lineRule="auto"/>
+        <w:jc w:val="both"/>
+      </w:pPr>
+      <w:r>
+        <w:rPr>
+          <w:rFonts w:ascii="Times New Roman" w:hAnsi="Times New Roman"/>
+          <w:b w:val="0"/>
+          <w:sz w:val="24"/>
+        </w:rPr>
+        <w:t>Palavras-chave: MedAgenda. Agenda médica. Pacientes. Sistema web. Requisitos.</w:t>
+      </w:r>
+    </w:p>
+    <w:p>
+      <w:r>
+        <w:br w:type="page"/>
+      </w:r>
+    </w:p>
+    <w:p>
+      <w:pPr>
+        <w:spacing w:line="360" w:lineRule="auto" w:after="0"/>
+        <w:jc w:val="center"/>
+      </w:pPr>
+      <w:r>
+        <w:rPr>
+          <w:rFonts w:ascii="Times New Roman" w:hAnsi="Times New Roman"/>
+          <w:b/>
+          <w:sz w:val="24"/>
+        </w:rPr>
+        <w:t>ABSTRACT</w:t>
+      </w:r>
+    </w:p>
+    <w:p/>
+    <w:p>
+      <w:pPr>
+        <w:spacing w:line="360" w:lineRule="auto" w:after="0"/>
+        <w:ind w:firstLine="709"/>
+        <w:jc w:val="both"/>
+      </w:pPr>
+      <w:r>
+        <w:rPr>
+          <w:rFonts w:ascii="Times New Roman" w:hAnsi="Times New Roman"/>
+          <w:b w:val="0"/>
+          <w:sz w:val="24"/>
+        </w:rPr>
+        <w:t>This document describes a arquitetura técnica do MedAgenda, incluindo frontend, backend, banco de dados, autenticação, segurança e decisões estruturais adotadas no desenvolvimento.</w:t>
+      </w:r>
+    </w:p>
+    <w:p/>
+    <w:p>
+      <w:pPr>
+        <w:spacing w:line="360" w:lineRule="auto"/>
+        <w:jc w:val="both"/>
+      </w:pPr>
+      <w:r>
+        <w:rPr>
+          <w:rFonts w:ascii="Times New Roman" w:hAnsi="Times New Roman"/>
+          <w:b w:val="0"/>
+          <w:sz w:val="24"/>
+        </w:rPr>
+        <w:t>Keywords: MedAgenda. Medical schedule. Patients. Web system. Requirements.</w:t>
+      </w:r>
+    </w:p>
+    <w:p>
+      <w:r>
+        <w:br w:type="page"/>
+      </w:r>
+    </w:p>
+    <w:p>
+      <w:pPr>
+        <w:spacing w:line="360" w:lineRule="auto" w:after="0"/>
         <w:jc w:val="center"/>
       </w:pPr>
       <w:r>
@@ -287,120 +390,12 @@
     </w:p>
     <w:p/>
     <w:p>
-      <w:pPr>
-        <w:spacing w:line="360" w:lineRule="auto"/>
-        <w:ind w:left="425"/>
-      </w:pPr>
       <w:r>
-        <w:rPr>
-          <w:rFonts w:ascii="Times New Roman" w:hAnsi="Times New Roman"/>
-          <w:sz w:val="24"/>
-        </w:rPr>
-        <w:t>1. Visão geral</w:t>
-      </w:r>
-    </w:p>
-    <w:p>
-      <w:pPr>
-        <w:spacing w:line="360" w:lineRule="auto"/>
-        <w:ind w:left="425"/>
-      </w:pPr>
-      <w:r>
-        <w:rPr>
-          <w:rFonts w:ascii="Times New Roman" w:hAnsi="Times New Roman"/>
-          <w:sz w:val="24"/>
-        </w:rPr>
-        <w:t>2. Frontend</w:t>
-      </w:r>
-    </w:p>
-    <w:p>
-      <w:pPr>
-        <w:spacing w:line="360" w:lineRule="auto"/>
-        <w:ind w:left="425"/>
-      </w:pPr>
-      <w:r>
-        <w:rPr>
-          <w:rFonts w:ascii="Times New Roman" w:hAnsi="Times New Roman"/>
-          <w:sz w:val="24"/>
-        </w:rPr>
-        <w:t>3. Backend</w:t>
-      </w:r>
-    </w:p>
-    <w:p>
-      <w:pPr>
-        <w:spacing w:line="360" w:lineRule="auto"/>
-        <w:ind w:left="425"/>
-      </w:pPr>
-      <w:r>
-        <w:rPr>
-          <w:rFonts w:ascii="Times New Roman" w:hAnsi="Times New Roman"/>
-          <w:sz w:val="24"/>
-        </w:rPr>
-        <w:t>4. Banco de dados</w:t>
-      </w:r>
-    </w:p>
-    <w:p>
-      <w:pPr>
-        <w:spacing w:line="360" w:lineRule="auto"/>
-        <w:ind w:left="425"/>
-      </w:pPr>
-      <w:r>
-        <w:rPr>
-          <w:rFonts w:ascii="Times New Roman" w:hAnsi="Times New Roman"/>
-          <w:sz w:val="24"/>
-        </w:rPr>
-        <w:t>5. Autenticação</w:t>
-      </w:r>
-    </w:p>
-    <w:p>
-      <w:pPr>
-        <w:spacing w:line="360" w:lineRule="auto"/>
-        <w:ind w:left="425"/>
-      </w:pPr>
-      <w:r>
-        <w:rPr>
-          <w:rFonts w:ascii="Times New Roman" w:hAnsi="Times New Roman"/>
-          <w:sz w:val="24"/>
-        </w:rPr>
-        <w:t>6. CORS</w:t>
-      </w:r>
-    </w:p>
-    <w:p>
-      <w:pPr>
-        <w:spacing w:line="360" w:lineRule="auto"/>
-        <w:ind w:left="425"/>
-      </w:pPr>
-      <w:r>
-        <w:rPr>
-          <w:rFonts w:ascii="Times New Roman" w:hAnsi="Times New Roman"/>
-          <w:sz w:val="24"/>
-        </w:rPr>
-        <w:t>7. Ambiente local</w:t>
-      </w:r>
-    </w:p>
-    <w:p>
-      <w:pPr>
-        <w:spacing w:line="360" w:lineRule="auto"/>
-        <w:ind w:left="425"/>
-      </w:pPr>
-      <w:r>
-        <w:rPr>
-          <w:rFonts w:ascii="Times New Roman" w:hAnsi="Times New Roman"/>
-          <w:sz w:val="24"/>
-        </w:rPr>
-        <w:t>8. Decisões arquiteturais</w:t>
-      </w:r>
-    </w:p>
-    <w:p>
-      <w:pPr>
-        <w:spacing w:line="360" w:lineRule="auto"/>
-        <w:ind w:left="425"/>
-      </w:pPr>
-      <w:r>
-        <w:rPr>
-          <w:rFonts w:ascii="Times New Roman" w:hAnsi="Times New Roman"/>
-          <w:sz w:val="24"/>
-        </w:rPr>
-        <w:t>9. Limitações atuais</w:t>
+        <w:fldChar w:fldCharType="begin"/>
+        <w:instrText xml:space="preserve">TOC \o "1-3" \h \z \u</w:instrText>
+        <w:fldChar w:fldCharType="separate"/>
+        <w:t>Clique com o botão direito e selecione "Atualizar campo" para gerar o sumário.</w:t>
+        <w:fldChar w:fldCharType="end"/>
       </w:r>
     </w:p>
     <w:p>
@@ -410,7 +405,18 @@
     </w:p>
     <w:p>
       <w:pPr>
-        <w:spacing w:before="240" w:after="120" w:line="360" w:lineRule="auto"/>
+        <w:sectPr>
+          <w:headerReference w:type="default" r:id="rId9"/>
+          <w:pgSz w:w="12240" w:h="15840"/>
+          <w:pgMar w:top="1701" w:right="1134" w:bottom="1134" w:left="1701" w:header="720" w:footer="720" w:gutter="0"/>
+          <w:cols w:space="720"/>
+          <w:docGrid w:linePitch="360"/>
+        </w:sectPr>
+      </w:pPr>
+    </w:p>
+    <w:p>
+      <w:pPr>
+        <w:pStyle w:val="Heading1"/>
         <w:jc w:val="left"/>
       </w:pPr>
       <w:r>
@@ -419,32 +425,19 @@
           <w:b/>
           <w:sz w:val="24"/>
         </w:rPr>
-        <w:t>ARQUITETURA DO PROJETO - MEDAGENDA</w:t>
+        <w:t>1 VISÃO GERAL</w:t>
       </w:r>
     </w:p>
     <w:p>
       <w:pPr>
-        <w:spacing w:before="240" w:after="120" w:line="360" w:lineRule="auto"/>
-        <w:jc w:val="left"/>
+        <w:spacing w:line="360" w:lineRule="auto" w:after="0"/>
+        <w:ind w:firstLine="709"/>
+        <w:jc w:val="both"/>
       </w:pPr>
       <w:r>
         <w:rPr>
           <w:rFonts w:ascii="Times New Roman" w:hAnsi="Times New Roman"/>
-          <w:b/>
-          <w:sz w:val="24"/>
-        </w:rPr>
-        <w:t>1. VISÃO GERAL</w:t>
-      </w:r>
-    </w:p>
-    <w:p>
-      <w:pPr>
-        <w:spacing w:line="360" w:lineRule="auto" w:after="0"/>
-        <w:ind w:firstLine="709"/>
-        <w:jc w:val="both"/>
-      </w:pPr>
-      <w:r>
-        <w:rPr>
-          <w:rFonts w:ascii="Times New Roman" w:hAnsi="Times New Roman"/>
+          <w:b w:val="0"/>
           <w:sz w:val="24"/>
         </w:rPr>
         <w:t>O MedAgenda segue uma arquitetura web em camadas, separando interface,</w:t>
@@ -459,6 +452,7 @@
       <w:r>
         <w:rPr>
           <w:rFonts w:ascii="Times New Roman" w:hAnsi="Times New Roman"/>
+          <w:b w:val="0"/>
           <w:sz w:val="24"/>
         </w:rPr>
         <w:t>processamento de regras de negócio e persistência de dados.</w:t>
@@ -468,6 +462,7 @@
       <w:pPr>
         <w:spacing w:line="240" w:lineRule="auto"/>
         <w:ind w:left="567"/>
+        <w:jc w:val="left"/>
       </w:pPr>
       <w:r>
         <w:rPr>
@@ -481,6 +476,7 @@
       <w:pPr>
         <w:spacing w:line="240" w:lineRule="auto"/>
         <w:ind w:left="567"/>
+        <w:jc w:val="left"/>
       </w:pPr>
       <w:r>
         <w:rPr>
@@ -494,6 +490,7 @@
       <w:pPr>
         <w:spacing w:line="240" w:lineRule="auto"/>
         <w:ind w:left="567"/>
+        <w:jc w:val="left"/>
       </w:pPr>
       <w:r>
         <w:rPr>
@@ -507,6 +504,7 @@
       <w:pPr>
         <w:spacing w:line="240" w:lineRule="auto"/>
         <w:ind w:left="567"/>
+        <w:jc w:val="left"/>
       </w:pPr>
       <w:r>
         <w:rPr>
@@ -520,6 +518,7 @@
       <w:pPr>
         <w:spacing w:line="240" w:lineRule="auto"/>
         <w:ind w:left="567"/>
+        <w:jc w:val="left"/>
       </w:pPr>
       <w:r>
         <w:rPr>
@@ -533,6 +532,7 @@
       <w:pPr>
         <w:spacing w:line="240" w:lineRule="auto"/>
         <w:ind w:left="567"/>
+        <w:jc w:val="left"/>
       </w:pPr>
       <w:r>
         <w:rPr>
@@ -546,6 +546,7 @@
       <w:pPr>
         <w:spacing w:line="240" w:lineRule="auto"/>
         <w:ind w:left="567"/>
+        <w:jc w:val="left"/>
       </w:pPr>
       <w:r>
         <w:rPr>
@@ -559,6 +560,7 @@
       <w:pPr>
         <w:spacing w:line="240" w:lineRule="auto"/>
         <w:ind w:left="567"/>
+        <w:jc w:val="left"/>
       </w:pPr>
       <w:r>
         <w:rPr>
@@ -572,6 +574,7 @@
       <w:pPr>
         <w:spacing w:line="240" w:lineRule="auto"/>
         <w:ind w:left="567"/>
+        <w:jc w:val="left"/>
       </w:pPr>
       <w:r>
         <w:rPr>
@@ -585,6 +588,7 @@
       <w:pPr>
         <w:spacing w:line="240" w:lineRule="auto"/>
         <w:ind w:left="567"/>
+        <w:jc w:val="left"/>
       </w:pPr>
       <w:r>
         <w:rPr>
@@ -598,6 +602,7 @@
       <w:pPr>
         <w:spacing w:line="240" w:lineRule="auto"/>
         <w:ind w:left="567"/>
+        <w:jc w:val="left"/>
       </w:pPr>
       <w:r>
         <w:rPr>
@@ -611,6 +616,7 @@
       <w:pPr>
         <w:spacing w:line="240" w:lineRule="auto"/>
         <w:ind w:left="567"/>
+        <w:jc w:val="left"/>
       </w:pPr>
       <w:r>
         <w:rPr>
@@ -624,6 +630,7 @@
       <w:pPr>
         <w:spacing w:line="240" w:lineRule="auto"/>
         <w:ind w:left="567"/>
+        <w:jc w:val="left"/>
       </w:pPr>
       <w:r>
         <w:rPr>
@@ -636,7 +643,7 @@
     <w:p/>
     <w:p>
       <w:pPr>
-        <w:spacing w:before="240" w:after="120" w:line="360" w:lineRule="auto"/>
+        <w:pStyle w:val="Heading1"/>
         <w:jc w:val="left"/>
       </w:pPr>
       <w:r>
@@ -645,7 +652,7 @@
           <w:b/>
           <w:sz w:val="24"/>
         </w:rPr>
-        <w:t>2. FRONTEND</w:t>
+        <w:t>2 FRONTEND</w:t>
       </w:r>
     </w:p>
     <w:p>
@@ -657,6 +664,7 @@
       <w:r>
         <w:rPr>
           <w:rFonts w:ascii="Times New Roman" w:hAnsi="Times New Roman"/>
+          <w:b w:val="0"/>
           <w:sz w:val="24"/>
         </w:rPr>
         <w:t>O frontend está localizado em frontend/ e utiliza React com Vite.</w:t>
@@ -671,6 +679,7 @@
       <w:r>
         <w:rPr>
           <w:rFonts w:ascii="Times New Roman" w:hAnsi="Times New Roman"/>
+          <w:b w:val="0"/>
           <w:sz w:val="24"/>
         </w:rPr>
         <w:t>Responsabilidades:</w:t>
@@ -684,6 +693,7 @@
       <w:r>
         <w:rPr>
           <w:rFonts w:ascii="Times New Roman" w:hAnsi="Times New Roman"/>
+          <w:b w:val="0"/>
           <w:sz w:val="24"/>
         </w:rPr>
         <w:t>apresentar as telas ao usuário;</w:t>
@@ -697,6 +707,7 @@
       <w:r>
         <w:rPr>
           <w:rFonts w:ascii="Times New Roman" w:hAnsi="Times New Roman"/>
+          <w:b w:val="0"/>
           <w:sz w:val="24"/>
         </w:rPr>
         <w:t>controlar navegação com React Router;</w:t>
@@ -710,6 +721,7 @@
       <w:r>
         <w:rPr>
           <w:rFonts w:ascii="Times New Roman" w:hAnsi="Times New Roman"/>
+          <w:b w:val="0"/>
           <w:sz w:val="24"/>
         </w:rPr>
         <w:t>armazenar token JWT no navegador;</w:t>
@@ -723,6 +735,7 @@
       <w:r>
         <w:rPr>
           <w:rFonts w:ascii="Times New Roman" w:hAnsi="Times New Roman"/>
+          <w:b w:val="0"/>
           <w:sz w:val="24"/>
         </w:rPr>
         <w:t>chamar endpoints do backend;</w:t>
@@ -736,6 +749,7 @@
       <w:r>
         <w:rPr>
           <w:rFonts w:ascii="Times New Roman" w:hAnsi="Times New Roman"/>
+          <w:b w:val="0"/>
           <w:sz w:val="24"/>
         </w:rPr>
         <w:t>validar campos para melhorar a experiência do usuário;</w:t>
@@ -749,6 +763,7 @@
       <w:r>
         <w:rPr>
           <w:rFonts w:ascii="Times New Roman" w:hAnsi="Times New Roman"/>
+          <w:b w:val="0"/>
           <w:sz w:val="24"/>
         </w:rPr>
         <w:t>exibir mensagens de erro e estados de carregamento.</w:t>
@@ -763,6 +778,7 @@
       <w:r>
         <w:rPr>
           <w:rFonts w:ascii="Times New Roman" w:hAnsi="Times New Roman"/>
+          <w:b w:val="0"/>
           <w:sz w:val="24"/>
         </w:rPr>
         <w:t>Arquivos relevantes:</w:t>
@@ -776,6 +792,7 @@
       <w:r>
         <w:rPr>
           <w:rFonts w:ascii="Times New Roman" w:hAnsi="Times New Roman"/>
+          <w:b w:val="0"/>
           <w:sz w:val="24"/>
         </w:rPr>
         <w:t>src/App.jsx: rotas da aplicação;</w:t>
@@ -789,6 +806,7 @@
       <w:r>
         <w:rPr>
           <w:rFonts w:ascii="Times New Roman" w:hAnsi="Times New Roman"/>
+          <w:b w:val="0"/>
           <w:sz w:val="24"/>
         </w:rPr>
         <w:t>src/auth/AuthContext.jsx: estado de autenticação;</w:t>
@@ -802,6 +820,7 @@
       <w:r>
         <w:rPr>
           <w:rFonts w:ascii="Times New Roman" w:hAnsi="Times New Roman"/>
+          <w:b w:val="0"/>
           <w:sz w:val="24"/>
         </w:rPr>
         <w:t>src/auth/ProtectedRoute.jsx: proteção de rotas internas;</w:t>
@@ -815,6 +834,7 @@
       <w:r>
         <w:rPr>
           <w:rFonts w:ascii="Times New Roman" w:hAnsi="Times New Roman"/>
+          <w:b w:val="0"/>
           <w:sz w:val="24"/>
         </w:rPr>
         <w:t>src/api/client.js: cliente HTTP;</w:t>
@@ -828,6 +848,7 @@
       <w:r>
         <w:rPr>
           <w:rFonts w:ascii="Times New Roman" w:hAnsi="Times New Roman"/>
+          <w:b w:val="0"/>
           <w:sz w:val="24"/>
         </w:rPr>
         <w:t>src/pages/LoginPage.jsx: login real;</w:t>
@@ -841,6 +862,7 @@
       <w:r>
         <w:rPr>
           <w:rFonts w:ascii="Times New Roman" w:hAnsi="Times New Roman"/>
+          <w:b w:val="0"/>
           <w:sz w:val="24"/>
         </w:rPr>
         <w:t>src/pages/PacientesPage.jsx: CRUD parcial real de pacientes;</w:t>
@@ -854,6 +876,7 @@
       <w:r>
         <w:rPr>
           <w:rFonts w:ascii="Times New Roman" w:hAnsi="Times New Roman"/>
+          <w:b w:val="0"/>
           <w:sz w:val="24"/>
         </w:rPr>
         <w:t>src/styles.css: design system e estilos globais.</w:t>
@@ -861,7 +884,7 @@
     </w:p>
     <w:p>
       <w:pPr>
-        <w:spacing w:before="240" w:after="120" w:line="360" w:lineRule="auto"/>
+        <w:pStyle w:val="Heading1"/>
         <w:jc w:val="left"/>
       </w:pPr>
       <w:r>
@@ -870,7 +893,7 @@
           <w:b/>
           <w:sz w:val="24"/>
         </w:rPr>
-        <w:t>3. BACKEND</w:t>
+        <w:t>3 BACKEND</w:t>
       </w:r>
     </w:p>
     <w:p>
@@ -882,6 +905,7 @@
       <w:r>
         <w:rPr>
           <w:rFonts w:ascii="Times New Roman" w:hAnsi="Times New Roman"/>
+          <w:b w:val="0"/>
           <w:sz w:val="24"/>
         </w:rPr>
         <w:t>O backend está localizado em backend/ e utiliza Java Spring Boot.</w:t>
@@ -896,6 +920,7 @@
       <w:r>
         <w:rPr>
           <w:rFonts w:ascii="Times New Roman" w:hAnsi="Times New Roman"/>
+          <w:b w:val="0"/>
           <w:sz w:val="24"/>
         </w:rPr>
         <w:t>Responsabilidades:</w:t>
@@ -909,6 +934,7 @@
       <w:r>
         <w:rPr>
           <w:rFonts w:ascii="Times New Roman" w:hAnsi="Times New Roman"/>
+          <w:b w:val="0"/>
           <w:sz w:val="24"/>
         </w:rPr>
         <w:t>expor API REST;</w:t>
@@ -922,6 +948,7 @@
       <w:r>
         <w:rPr>
           <w:rFonts w:ascii="Times New Roman" w:hAnsi="Times New Roman"/>
+          <w:b w:val="0"/>
           <w:sz w:val="24"/>
         </w:rPr>
         <w:t>autenticar usuários;</w:t>
@@ -935,6 +962,7 @@
       <w:r>
         <w:rPr>
           <w:rFonts w:ascii="Times New Roman" w:hAnsi="Times New Roman"/>
+          <w:b w:val="0"/>
           <w:sz w:val="24"/>
         </w:rPr>
         <w:t>gerar e validar JWT;</w:t>
@@ -948,6 +976,7 @@
       <w:r>
         <w:rPr>
           <w:rFonts w:ascii="Times New Roman" w:hAnsi="Times New Roman"/>
+          <w:b w:val="0"/>
           <w:sz w:val="24"/>
         </w:rPr>
         <w:t>aplicar regras de negócio;</w:t>
@@ -961,6 +990,7 @@
       <w:r>
         <w:rPr>
           <w:rFonts w:ascii="Times New Roman" w:hAnsi="Times New Roman"/>
+          <w:b w:val="0"/>
           <w:sz w:val="24"/>
         </w:rPr>
         <w:t>persistir dados com JPA;</w:t>
@@ -974,6 +1004,7 @@
       <w:r>
         <w:rPr>
           <w:rFonts w:ascii="Times New Roman" w:hAnsi="Times New Roman"/>
+          <w:b w:val="0"/>
           <w:sz w:val="24"/>
         </w:rPr>
         <w:t>proteger endpoints internos.</w:t>
@@ -988,6 +1019,7 @@
       <w:r>
         <w:rPr>
           <w:rFonts w:ascii="Times New Roman" w:hAnsi="Times New Roman"/>
+          <w:b w:val="0"/>
           <w:sz w:val="24"/>
         </w:rPr>
         <w:t>Camadas principais:</w:t>
@@ -997,6 +1029,7 @@
       <w:pPr>
         <w:spacing w:line="240" w:lineRule="auto"/>
         <w:ind w:left="567"/>
+        <w:jc w:val="left"/>
       </w:pPr>
       <w:r>
         <w:rPr>
@@ -1009,7 +1042,7 @@
     <w:p/>
     <w:p>
       <w:pPr>
-        <w:spacing w:before="240" w:after="120" w:line="360" w:lineRule="auto"/>
+        <w:pStyle w:val="Heading2"/>
         <w:jc w:val="left"/>
       </w:pPr>
       <w:r>
@@ -1018,7 +1051,7 @@
           <w:b/>
           <w:sz w:val="24"/>
         </w:rPr>
-        <w:t>Controller</w:t>
+        <w:t>3.1 Controller</w:t>
       </w:r>
     </w:p>
     <w:p>
@@ -1030,6 +1063,7 @@
       <w:r>
         <w:rPr>
           <w:rFonts w:ascii="Times New Roman" w:hAnsi="Times New Roman"/>
+          <w:b w:val="0"/>
           <w:sz w:val="24"/>
         </w:rPr>
         <w:t>Recebe requisições HTTP e retorna respostas JSON.</w:t>
@@ -1044,6 +1078,7 @@
       <w:r>
         <w:rPr>
           <w:rFonts w:ascii="Times New Roman" w:hAnsi="Times New Roman"/>
+          <w:b w:val="0"/>
           <w:sz w:val="24"/>
         </w:rPr>
         <w:t>Exemplo:</w:t>
@@ -1057,6 +1092,7 @@
       <w:r>
         <w:rPr>
           <w:rFonts w:ascii="Times New Roman" w:hAnsi="Times New Roman"/>
+          <w:b w:val="0"/>
           <w:sz w:val="24"/>
         </w:rPr>
         <w:t>PacienteController</w:t>
@@ -1070,6 +1106,7 @@
       <w:r>
         <w:rPr>
           <w:rFonts w:ascii="Times New Roman" w:hAnsi="Times New Roman"/>
+          <w:b w:val="0"/>
           <w:sz w:val="24"/>
         </w:rPr>
         <w:t>AuthController</w:t>
@@ -1077,7 +1114,7 @@
     </w:p>
     <w:p>
       <w:pPr>
-        <w:spacing w:before="240" w:after="120" w:line="360" w:lineRule="auto"/>
+        <w:pStyle w:val="Heading2"/>
         <w:jc w:val="left"/>
       </w:pPr>
       <w:r>
@@ -1086,7 +1123,7 @@
           <w:b/>
           <w:sz w:val="24"/>
         </w:rPr>
-        <w:t>Service</w:t>
+        <w:t>3.2 Service</w:t>
       </w:r>
     </w:p>
     <w:p>
@@ -1098,6 +1135,7 @@
       <w:r>
         <w:rPr>
           <w:rFonts w:ascii="Times New Roman" w:hAnsi="Times New Roman"/>
+          <w:b w:val="0"/>
           <w:sz w:val="24"/>
         </w:rPr>
         <w:t>Concentra regras de negócio.</w:t>
@@ -1112,6 +1150,7 @@
       <w:r>
         <w:rPr>
           <w:rFonts w:ascii="Times New Roman" w:hAnsi="Times New Roman"/>
+          <w:b w:val="0"/>
           <w:sz w:val="24"/>
         </w:rPr>
         <w:t>Exemplo:</w:t>
@@ -1125,6 +1164,7 @@
       <w:r>
         <w:rPr>
           <w:rFonts w:ascii="Times New Roman" w:hAnsi="Times New Roman"/>
+          <w:b w:val="0"/>
           <w:sz w:val="24"/>
         </w:rPr>
         <w:t>validação de CPF;</w:t>
@@ -1138,6 +1178,7 @@
       <w:r>
         <w:rPr>
           <w:rFonts w:ascii="Times New Roman" w:hAnsi="Times New Roman"/>
+          <w:b w:val="0"/>
           <w:sz w:val="24"/>
         </w:rPr>
         <w:t>bloqueio de CPF duplicado;</w:t>
@@ -1151,6 +1192,7 @@
       <w:r>
         <w:rPr>
           <w:rFonts w:ascii="Times New Roman" w:hAnsi="Times New Roman"/>
+          <w:b w:val="0"/>
           <w:sz w:val="24"/>
         </w:rPr>
         <w:t>bloqueio de data de nascimento futura;</w:t>
@@ -1164,6 +1206,7 @@
       <w:r>
         <w:rPr>
           <w:rFonts w:ascii="Times New Roman" w:hAnsi="Times New Roman"/>
+          <w:b w:val="0"/>
           <w:sz w:val="24"/>
         </w:rPr>
         <w:t>normalização de dados antes de salvar.</w:t>
@@ -1171,7 +1214,7 @@
     </w:p>
     <w:p>
       <w:pPr>
-        <w:spacing w:before="240" w:after="120" w:line="360" w:lineRule="auto"/>
+        <w:pStyle w:val="Heading2"/>
         <w:jc w:val="left"/>
       </w:pPr>
       <w:r>
@@ -1180,7 +1223,7 @@
           <w:b/>
           <w:sz w:val="24"/>
         </w:rPr>
-        <w:t>Repository</w:t>
+        <w:t>3.3 Repository</w:t>
       </w:r>
     </w:p>
     <w:p>
@@ -1192,6 +1235,7 @@
       <w:r>
         <w:rPr>
           <w:rFonts w:ascii="Times New Roman" w:hAnsi="Times New Roman"/>
+          <w:b w:val="0"/>
           <w:sz w:val="24"/>
         </w:rPr>
         <w:t>Interface com o banco de dados por meio do Spring Data JPA.</w:t>
@@ -1199,7 +1243,7 @@
     </w:p>
     <w:p>
       <w:pPr>
-        <w:spacing w:before="240" w:after="120" w:line="360" w:lineRule="auto"/>
+        <w:pStyle w:val="Heading2"/>
         <w:jc w:val="left"/>
       </w:pPr>
       <w:r>
@@ -1208,7 +1252,7 @@
           <w:b/>
           <w:sz w:val="24"/>
         </w:rPr>
-        <w:t>Entity</w:t>
+        <w:t>3.4 Entity</w:t>
       </w:r>
     </w:p>
     <w:p>
@@ -1220,6 +1264,7 @@
       <w:r>
         <w:rPr>
           <w:rFonts w:ascii="Times New Roman" w:hAnsi="Times New Roman"/>
+          <w:b w:val="0"/>
           <w:sz w:val="24"/>
         </w:rPr>
         <w:t>Classes que representam tabelas do banco de dados.</w:t>
@@ -1227,7 +1272,7 @@
     </w:p>
     <w:p>
       <w:pPr>
-        <w:spacing w:before="240" w:after="120" w:line="360" w:lineRule="auto"/>
+        <w:pStyle w:val="Heading1"/>
         <w:jc w:val="left"/>
       </w:pPr>
       <w:r>
@@ -1236,7 +1281,7 @@
           <w:b/>
           <w:sz w:val="24"/>
         </w:rPr>
-        <w:t>4. BANCO DE DADOS</w:t>
+        <w:t>4 BANCO DE DADOS</w:t>
       </w:r>
     </w:p>
     <w:p>
@@ -1248,6 +1293,7 @@
       <w:r>
         <w:rPr>
           <w:rFonts w:ascii="Times New Roman" w:hAnsi="Times New Roman"/>
+          <w:b w:val="0"/>
           <w:sz w:val="24"/>
         </w:rPr>
         <w:t>O banco utilizado é PostgreSQL. Para execução local, o projeto possui</w:t>
@@ -1262,6 +1308,7 @@
       <w:r>
         <w:rPr>
           <w:rFonts w:ascii="Times New Roman" w:hAnsi="Times New Roman"/>
+          <w:b w:val="0"/>
           <w:sz w:val="24"/>
         </w:rPr>
         <w:t>docker-compose.yml, que sobe um container com:</w:t>
@@ -1271,6 +1318,7 @@
       <w:pPr>
         <w:spacing w:line="240" w:lineRule="auto"/>
         <w:ind w:left="567"/>
+        <w:jc w:val="left"/>
       </w:pPr>
       <w:r>
         <w:rPr>
@@ -1284,6 +1332,7 @@
       <w:pPr>
         <w:spacing w:line="240" w:lineRule="auto"/>
         <w:ind w:left="567"/>
+        <w:jc w:val="left"/>
       </w:pPr>
       <w:r>
         <w:rPr>
@@ -1297,6 +1346,7 @@
       <w:pPr>
         <w:spacing w:line="240" w:lineRule="auto"/>
         <w:ind w:left="567"/>
+        <w:jc w:val="left"/>
       </w:pPr>
       <w:r>
         <w:rPr>
@@ -1310,6 +1360,7 @@
       <w:pPr>
         <w:spacing w:line="240" w:lineRule="auto"/>
         <w:ind w:left="567"/>
+        <w:jc w:val="left"/>
       </w:pPr>
       <w:r>
         <w:rPr>
@@ -1322,7 +1373,7 @@
     <w:p/>
     <w:p>
       <w:pPr>
-        <w:spacing w:before="240" w:after="120" w:line="360" w:lineRule="auto"/>
+        <w:pStyle w:val="Heading1"/>
         <w:jc w:val="left"/>
       </w:pPr>
       <w:r>
@@ -1331,7 +1382,7 @@
           <w:b/>
           <w:sz w:val="24"/>
         </w:rPr>
-        <w:t>5. AUTENTICAÇÃO</w:t>
+        <w:t>5 AUTENTICAÇÃO</w:t>
       </w:r>
     </w:p>
     <w:p>
@@ -1343,6 +1394,7 @@
       <w:r>
         <w:rPr>
           <w:rFonts w:ascii="Times New Roman" w:hAnsi="Times New Roman"/>
+          <w:b w:val="0"/>
           <w:sz w:val="24"/>
         </w:rPr>
         <w:t>A autenticação usa JWT.</w:t>
@@ -1357,6 +1409,7 @@
       <w:r>
         <w:rPr>
           <w:rFonts w:ascii="Times New Roman" w:hAnsi="Times New Roman"/>
+          <w:b w:val="0"/>
           <w:sz w:val="24"/>
         </w:rPr>
         <w:t>Fluxo:</w:t>
@@ -1370,6 +1423,7 @@
       <w:r>
         <w:rPr>
           <w:rFonts w:ascii="Times New Roman" w:hAnsi="Times New Roman"/>
+          <w:b w:val="0"/>
           <w:sz w:val="24"/>
         </w:rPr>
         <w:t>Usuário envia e-mail e senha.</w:t>
@@ -1383,6 +1437,7 @@
       <w:r>
         <w:rPr>
           <w:rFonts w:ascii="Times New Roman" w:hAnsi="Times New Roman"/>
+          <w:b w:val="0"/>
           <w:sz w:val="24"/>
         </w:rPr>
         <w:t>Backend valida as credenciais.</w:t>
@@ -1396,6 +1451,7 @@
       <w:r>
         <w:rPr>
           <w:rFonts w:ascii="Times New Roman" w:hAnsi="Times New Roman"/>
+          <w:b w:val="0"/>
           <w:sz w:val="24"/>
         </w:rPr>
         <w:t>Backend retorna token JWT.</w:t>
@@ -1409,6 +1465,7 @@
       <w:r>
         <w:rPr>
           <w:rFonts w:ascii="Times New Roman" w:hAnsi="Times New Roman"/>
+          <w:b w:val="0"/>
           <w:sz w:val="24"/>
         </w:rPr>
         <w:t>Frontend salva o token.</w:t>
@@ -1422,6 +1479,7 @@
       <w:r>
         <w:rPr>
           <w:rFonts w:ascii="Times New Roman" w:hAnsi="Times New Roman"/>
+          <w:b w:val="0"/>
           <w:sz w:val="24"/>
         </w:rPr>
         <w:t>Frontend envia o token no header:</w:t>
@@ -1431,6 +1489,7 @@
       <w:pPr>
         <w:spacing w:line="240" w:lineRule="auto"/>
         <w:ind w:left="567"/>
+        <w:jc w:val="left"/>
       </w:pPr>
       <w:r>
         <w:rPr>
@@ -1450,6 +1509,7 @@
       <w:r>
         <w:rPr>
           <w:rFonts w:ascii="Times New Roman" w:hAnsi="Times New Roman"/>
+          <w:b w:val="0"/>
           <w:sz w:val="24"/>
         </w:rPr>
         <w:t>Rotas públicas:</w:t>
@@ -1459,6 +1519,7 @@
       <w:pPr>
         <w:spacing w:line="240" w:lineRule="auto"/>
         <w:ind w:left="567"/>
+        <w:jc w:val="left"/>
       </w:pPr>
       <w:r>
         <w:rPr>
@@ -1472,6 +1533,7 @@
       <w:pPr>
         <w:spacing w:line="240" w:lineRule="auto"/>
         <w:ind w:left="567"/>
+        <w:jc w:val="left"/>
       </w:pPr>
       <w:r>
         <w:rPr>
@@ -1491,6 +1553,7 @@
       <w:r>
         <w:rPr>
           <w:rFonts w:ascii="Times New Roman" w:hAnsi="Times New Roman"/>
+          <w:b w:val="0"/>
           <w:sz w:val="24"/>
         </w:rPr>
         <w:t>Rotas protegidas:</w:t>
@@ -1500,6 +1563,7 @@
       <w:pPr>
         <w:spacing w:line="240" w:lineRule="auto"/>
         <w:ind w:left="567"/>
+        <w:jc w:val="left"/>
       </w:pPr>
       <w:r>
         <w:rPr>
@@ -1513,6 +1577,7 @@
       <w:pPr>
         <w:spacing w:line="240" w:lineRule="auto"/>
         <w:ind w:left="567"/>
+        <w:jc w:val="left"/>
       </w:pPr>
       <w:r>
         <w:rPr>
@@ -1526,6 +1591,7 @@
       <w:pPr>
         <w:spacing w:line="240" w:lineRule="auto"/>
         <w:ind w:left="567"/>
+        <w:jc w:val="left"/>
       </w:pPr>
       <w:r>
         <w:rPr>
@@ -1538,7 +1604,7 @@
     <w:p/>
     <w:p>
       <w:pPr>
-        <w:spacing w:before="240" w:after="120" w:line="360" w:lineRule="auto"/>
+        <w:pStyle w:val="Heading1"/>
         <w:jc w:val="left"/>
       </w:pPr>
       <w:r>
@@ -1547,7 +1613,7 @@
           <w:b/>
           <w:sz w:val="24"/>
         </w:rPr>
-        <w:t>6. CORS</w:t>
+        <w:t>6 CORS</w:t>
       </w:r>
     </w:p>
     <w:p>
@@ -1559,6 +1625,7 @@
       <w:r>
         <w:rPr>
           <w:rFonts w:ascii="Times New Roman" w:hAnsi="Times New Roman"/>
+          <w:b w:val="0"/>
           <w:sz w:val="24"/>
         </w:rPr>
         <w:t>O backend permite requisições do frontend local:</w:t>
@@ -1568,6 +1635,7 @@
       <w:pPr>
         <w:spacing w:line="240" w:lineRule="auto"/>
         <w:ind w:left="567"/>
+        <w:jc w:val="left"/>
       </w:pPr>
       <w:r>
         <w:rPr>
@@ -1581,6 +1649,7 @@
       <w:pPr>
         <w:spacing w:line="240" w:lineRule="auto"/>
         <w:ind w:left="567"/>
+        <w:jc w:val="left"/>
       </w:pPr>
       <w:r>
         <w:rPr>
@@ -1600,6 +1669,7 @@
       <w:r>
         <w:rPr>
           <w:rFonts w:ascii="Times New Roman" w:hAnsi="Times New Roman"/>
+          <w:b w:val="0"/>
           <w:sz w:val="24"/>
         </w:rPr>
         <w:t>Isso é necessário porque frontend e backend rodam em portas diferentes durante o</w:t>
@@ -1614,6 +1684,7 @@
       <w:r>
         <w:rPr>
           <w:rFonts w:ascii="Times New Roman" w:hAnsi="Times New Roman"/>
+          <w:b w:val="0"/>
           <w:sz w:val="24"/>
         </w:rPr>
         <w:t>desenvolvimento local.</w:t>
@@ -1621,7 +1692,7 @@
     </w:p>
     <w:p>
       <w:pPr>
-        <w:spacing w:before="240" w:after="120" w:line="360" w:lineRule="auto"/>
+        <w:pStyle w:val="Heading1"/>
         <w:jc w:val="left"/>
       </w:pPr>
       <w:r>
@@ -1630,7 +1701,7 @@
           <w:b/>
           <w:sz w:val="24"/>
         </w:rPr>
-        <w:t>7. AMBIENTE LOCAL</w:t>
+        <w:t>7 AMBIENTE LOCAL</w:t>
       </w:r>
     </w:p>
     <w:p>
@@ -1642,6 +1713,7 @@
       <w:r>
         <w:rPr>
           <w:rFonts w:ascii="Times New Roman" w:hAnsi="Times New Roman"/>
+          <w:b w:val="0"/>
           <w:sz w:val="24"/>
         </w:rPr>
         <w:t>Para facilitar demonstração, o projeto possui:</w:t>
@@ -1655,6 +1727,7 @@
       <w:r>
         <w:rPr>
           <w:rFonts w:ascii="Times New Roman" w:hAnsi="Times New Roman"/>
+          <w:b w:val="0"/>
           <w:sz w:val="24"/>
         </w:rPr>
         <w:t>Docker Compose para PostgreSQL;</w:t>
@@ -1668,6 +1741,7 @@
       <w:r>
         <w:rPr>
           <w:rFonts w:ascii="Times New Roman" w:hAnsi="Times New Roman"/>
+          <w:b w:val="0"/>
           <w:sz w:val="24"/>
         </w:rPr>
         <w:t>Maven Wrapper para rodar backend sem Maven global;</w:t>
@@ -1681,6 +1755,7 @@
       <w:r>
         <w:rPr>
           <w:rFonts w:ascii="Times New Roman" w:hAnsi="Times New Roman"/>
+          <w:b w:val="0"/>
           <w:sz w:val="24"/>
         </w:rPr>
         <w:t>perfil Spring local;</w:t>
@@ -1694,6 +1769,7 @@
       <w:r>
         <w:rPr>
           <w:rFonts w:ascii="Times New Roman" w:hAnsi="Times New Roman"/>
+          <w:b w:val="0"/>
           <w:sz w:val="24"/>
         </w:rPr>
         <w:t>dados de demonstração automáticos.</w:t>
@@ -1701,7 +1777,7 @@
     </w:p>
     <w:p>
       <w:pPr>
-        <w:spacing w:before="240" w:after="120" w:line="360" w:lineRule="auto"/>
+        <w:pStyle w:val="Heading1"/>
         <w:jc w:val="left"/>
       </w:pPr>
       <w:r>
@@ -1710,7 +1786,7 @@
           <w:b/>
           <w:sz w:val="24"/>
         </w:rPr>
-        <w:t>8. DECISÕES ARQUITETURAIS</w:t>
+        <w:t>8 DECISÕES ARQUITETURAIS</w:t>
       </w:r>
     </w:p>
     <w:tbl>
@@ -2126,7 +2202,7 @@
     <w:p/>
     <w:p>
       <w:pPr>
-        <w:spacing w:before="240" w:after="120" w:line="360" w:lineRule="auto"/>
+        <w:pStyle w:val="Heading1"/>
         <w:jc w:val="left"/>
       </w:pPr>
       <w:r>
@@ -2135,7 +2211,7 @@
           <w:b/>
           <w:sz w:val="24"/>
         </w:rPr>
-        <w:t>9. LIMITAÇÕES ATUAIS</w:t>
+        <w:t>9 LIMITAÇÕES ATUAIS</w:t>
       </w:r>
     </w:p>
     <w:p>
@@ -2146,6 +2222,7 @@
       <w:r>
         <w:rPr>
           <w:rFonts w:ascii="Times New Roman" w:hAnsi="Times New Roman"/>
+          <w:b w:val="0"/>
           <w:sz w:val="24"/>
         </w:rPr>
         <w:t>Dashboard, agenda e chatbot ainda usam dados mockados.</w:t>
@@ -2159,6 +2236,7 @@
       <w:r>
         <w:rPr>
           <w:rFonts w:ascii="Times New Roman" w:hAnsi="Times New Roman"/>
+          <w:b w:val="0"/>
           <w:sz w:val="24"/>
         </w:rPr>
         <w:t>Não há testes automatizados completos.</w:t>
@@ -2172,6 +2250,7 @@
       <w:r>
         <w:rPr>
           <w:rFonts w:ascii="Times New Roman" w:hAnsi="Times New Roman"/>
+          <w:b w:val="0"/>
           <w:sz w:val="24"/>
         </w:rPr>
         <w:t>Não há controle refinado de permissões por papel.</w:t>
@@ -2185,6 +2264,7 @@
       <w:r>
         <w:rPr>
           <w:rFonts w:ascii="Times New Roman" w:hAnsi="Times New Roman"/>
+          <w:b w:val="0"/>
           <w:sz w:val="24"/>
         </w:rPr>
         <w:t>Não há deploy em ambiente público.</w:t>
@@ -2198,9 +2278,113 @@
       <w:r>
         <w:rPr>
           <w:rFonts w:ascii="Times New Roman" w:hAnsi="Times New Roman"/>
+          <w:b w:val="0"/>
           <w:sz w:val="24"/>
         </w:rPr>
         <w:t>O chatbot ainda não cria consultas reais.</w:t>
+      </w:r>
+    </w:p>
+    <w:p>
+      <w:r>
+        <w:br w:type="page"/>
+      </w:r>
+    </w:p>
+    <w:p>
+      <w:pPr>
+        <w:jc w:val="left"/>
+      </w:pPr>
+      <w:r>
+        <w:rPr>
+          <w:rFonts w:ascii="Times New Roman" w:hAnsi="Times New Roman"/>
+          <w:b/>
+          <w:sz w:val="24"/>
+        </w:rPr>
+        <w:t>REFERÊNCIAS</w:t>
+      </w:r>
+    </w:p>
+    <w:p/>
+    <w:p>
+      <w:pPr>
+        <w:spacing w:line="240" w:lineRule="auto" w:after="240"/>
+        <w:jc w:val="left"/>
+      </w:pPr>
+      <w:r>
+        <w:rPr>
+          <w:rFonts w:ascii="Times New Roman" w:hAnsi="Times New Roman"/>
+          <w:b w:val="0"/>
+          <w:sz w:val="24"/>
+        </w:rPr>
+        <w:t>ASSOCIAÇÃO BRASILEIRA DE NORMAS TÉCNICAS. NBR 14724: informação e documentação: trabalhos acadêmicos: apresentação. Rio de Janeiro: ABNT, 2011.</w:t>
+      </w:r>
+    </w:p>
+    <w:p>
+      <w:pPr>
+        <w:spacing w:line="240" w:lineRule="auto" w:after="240"/>
+        <w:jc w:val="left"/>
+      </w:pPr>
+      <w:r>
+        <w:rPr>
+          <w:rFonts w:ascii="Times New Roman" w:hAnsi="Times New Roman"/>
+          <w:b w:val="0"/>
+          <w:sz w:val="24"/>
+        </w:rPr>
+        <w:t>ASSOCIAÇÃO BRASILEIRA DE NORMAS TÉCNICAS. NBR 6023: informação e documentação: referências: elaboração. Rio de Janeiro: ABNT, 2018.</w:t>
+      </w:r>
+    </w:p>
+    <w:p>
+      <w:pPr>
+        <w:spacing w:line="240" w:lineRule="auto" w:after="240"/>
+        <w:jc w:val="left"/>
+      </w:pPr>
+      <w:r>
+        <w:rPr>
+          <w:rFonts w:ascii="Times New Roman" w:hAnsi="Times New Roman"/>
+          <w:b w:val="0"/>
+          <w:sz w:val="24"/>
+        </w:rPr>
+        <w:t>ORACLE. Java Platform, Standard Edition Documentation. Disponível em: https://docs.oracle.com/en/java/. Acesso em: 30 maio 2026.</w:t>
+      </w:r>
+    </w:p>
+    <w:p>
+      <w:pPr>
+        <w:spacing w:line="240" w:lineRule="auto" w:after="240"/>
+        <w:jc w:val="left"/>
+      </w:pPr>
+      <w:r>
+        <w:rPr>
+          <w:rFonts w:ascii="Times New Roman" w:hAnsi="Times New Roman"/>
+          <w:b w:val="0"/>
+          <w:sz w:val="24"/>
+        </w:rPr>
+        <w:t>POSTGRESQL GLOBAL DEVELOPMENT GROUP. PostgreSQL Documentation. Disponível em: https://www.postgresql.org/docs/. Acesso em: 30 maio 2026.</w:t>
+      </w:r>
+    </w:p>
+    <w:p>
+      <w:pPr>
+        <w:spacing w:line="240" w:lineRule="auto" w:after="240"/>
+        <w:jc w:val="left"/>
+      </w:pPr>
+      <w:r>
+        <w:rPr>
+          <w:rFonts w:ascii="Times New Roman" w:hAnsi="Times New Roman"/>
+          <w:b w:val="0"/>
+          <w:sz w:val="24"/>
+        </w:rPr>
+        <w:t>REACT. React Documentation. Disponível em: https://react.dev/. Acesso em: 30 maio 2026.</w:t>
+      </w:r>
+    </w:p>
+    <w:p>
+      <w:pPr>
+        <w:spacing w:line="240" w:lineRule="auto" w:after="240"/>
+        <w:jc w:val="left"/>
+      </w:pPr>
+      <w:r>
+        <w:rPr>
+          <w:rFonts w:ascii="Times New Roman" w:hAnsi="Times New Roman"/>
+          <w:b w:val="0"/>
+          <w:sz w:val="24"/>
+        </w:rPr>
+        <w:t>SPRING. Spring Boot Reference Documentation. Disponível em: https://docs.spring.io/spring-boot/. Acesso em: 30 maio 2026.</w:t>
       </w:r>
     </w:p>
     <w:sectPr>
@@ -2208,9 +2392,31 @@
       <w:pgMar w:top="1701" w:right="1134" w:bottom="1134" w:left="1701" w:header="720" w:footer="720" w:gutter="0"/>
       <w:cols w:space="720"/>
       <w:docGrid w:linePitch="360"/>
+      <w:pgNumType w:start="1"/>
     </w:sectPr>
   </w:body>
 </w:document>
+</file>
+
+<file path=word/header1.xml><?xml version="1.0" encoding="utf-8"?>
+<w:hdr xmlns:m="http://schemas.openxmlformats.org/officeDocument/2006/math" xmlns:mc="http://schemas.openxmlformats.org/markup-compatibility/2006" xmlns:mo="http://schemas.microsoft.com/office/mac/office/2008/main" xmlns:mv="urn:schemas-microsoft-com:mac:vml" xmlns:o="urn:schemas-microsoft-com:office:office" xmlns:r="http://schemas.openxmlformats.org/officeDocument/2006/relationships" xmlns:v="urn:schemas-microsoft-com:vml" xmlns:w10="urn:schemas-microsoft-com:office:word" xmlns:w14="http://schemas.microsoft.com/office/word/2010/wordml" xmlns:w="http://schemas.openxmlformats.org/wordprocessingml/2006/main" xmlns:wne="http://schemas.microsoft.com/office/word/2006/wordml" xmlns:wp14="http://schemas.microsoft.com/office/word/2010/wordprocessingDrawing" xmlns:wp="http://schemas.openxmlformats.org/drawingml/2006/wordprocessingDrawing" xmlns:wpc="http://schemas.microsoft.com/office/word/2010/wordprocessingCanvas" xmlns:wpg="http://schemas.microsoft.com/office/word/2010/wordprocessingGroup" xmlns:wpi="http://schemas.microsoft.com/office/word/2010/wordprocessingInk" xmlns:wps="http://schemas.microsoft.com/office/word/2010/wordprocessingShape" mc:Ignorable="w14 wp14">
+  <w:p>
+    <w:pPr>
+      <w:pStyle w:val="Header"/>
+      <w:jc w:val="right"/>
+    </w:pPr>
+    <w:r>
+      <w:rPr>
+        <w:rFonts w:ascii="Times New Roman" w:hAnsi="Times New Roman"/>
+        <w:b w:val="0"/>
+        <w:sz w:val="24"/>
+      </w:rPr>
+      <w:fldChar w:fldCharType="begin"/>
+      <w:instrText xml:space="preserve">PAGE</w:instrText>
+      <w:fldChar w:fldCharType="end"/>
+    </w:r>
+  </w:p>
+</w:hdr>
 </file>
 
 <file path=word/numbering.xml><?xml version="1.0" encoding="utf-8"?>

</xml_diff>